<commit_message>
Update SQL Learning Guide Book.docx
</commit_message>
<xml_diff>
--- a/SQL Learning Guide Book.docx
+++ b/SQL Learning Guide Book.docx
@@ -29585,6 +29585,7 @@
         <w:rPr>
           <w:b/>
           <w:sz w:val="33"/>
+          <w:highlight w:val="magenta"/>
         </w:rPr>
         <w:t>Durability</w:t>
       </w:r>
@@ -29627,30 +29628,35 @@
       <w:pPr>
         <w:spacing w:before="240" w:line="288" w:lineRule="auto"/>
         <w:rPr>
-          <w:sz w:val="14"/>
-          <w:szCs w:val="14"/>
+          <w:sz w:val="12"/>
+          <w:szCs w:val="12"/>
         </w:rPr>
       </w:pPr>
       <w:bookmarkStart w:id="121" w:name="chapter_14_sql_for_analytics_reporting"/>
       <w:r>
         <w:rPr>
           <w:b/>
+          <w:sz w:val="36"/>
+          <w:szCs w:val="12"/>
+        </w:rPr>
+        <w:t>Chapter 14: SQL for Analytics &amp; Reporting</w:t>
+      </w:r>
+      <w:bookmarkEnd w:id="121"/>
+    </w:p>
+    <w:p>
+      <w:pPr>
+        <w:spacing w:before="240" w:line="271" w:lineRule="auto"/>
+        <w:rPr>
+          <w:sz w:val="20"/>
+          <w:szCs w:val="20"/>
+        </w:rPr>
+      </w:pPr>
+      <w:bookmarkStart w:id="122" w:name="window_functions"/>
+      <w:r>
+        <w:rPr>
+          <w:b/>
           <w:sz w:val="40"/>
-          <w:szCs w:val="14"/>
-        </w:rPr>
-        <w:t>Chapter 14: SQL for Analytics &amp; Reporting</w:t>
-      </w:r>
-      <w:bookmarkEnd w:id="121"/>
-    </w:p>
-    <w:p>
-      <w:pPr>
-        <w:spacing w:before="240" w:line="271" w:lineRule="auto"/>
-      </w:pPr>
-      <w:bookmarkStart w:id="122" w:name="window_functions"/>
-      <w:r>
-        <w:rPr>
-          <w:b/>
-          <w:sz w:val="42"/>
+          <w:szCs w:val="20"/>
         </w:rPr>
         <w:t>Window Functions</w:t>
       </w:r>
@@ -30080,7 +30086,20 @@
         <w:rPr>
           <w:rFonts w:asciiTheme="minorHAnsi" w:eastAsia="Georgia" w:cstheme="minorHAnsi"/>
         </w:rPr>
-        <w:t>SUM(salary) OVER (ORDER BY hire_date) AS running_total</w:t>
+        <w:t>SUM(salary) OVER (</w:t>
+      </w:r>
+      <w:r>
+        <w:rPr>
+          <w:rFonts w:asciiTheme="minorHAnsi" w:eastAsia="Georgia" w:cstheme="minorHAnsi"/>
+          <w:highlight w:val="cyan"/>
+        </w:rPr>
+        <w:t>ORDER BY hire_date</w:t>
+      </w:r>
+      <w:r>
+        <w:rPr>
+          <w:rFonts w:asciiTheme="minorHAnsi" w:eastAsia="Georgia" w:cstheme="minorHAnsi"/>
+        </w:rPr>
+        <w:t>) AS running_total</w:t>
       </w:r>
       <w:r>
         <w:rPr>
@@ -30174,6 +30193,7 @@
       <w:r>
         <w:rPr>
           <w:rFonts w:asciiTheme="minorHAnsi" w:eastAsia="Georgia" w:cstheme="minorHAnsi"/>
+          <w:highlight w:val="cyan"/>
         </w:rPr>
         <w:t>salary - AVG(salary) OVER (PARTITION BY department) AS diff_from_avg</w:t>
       </w:r>
@@ -30222,6 +30242,7 @@
         <w:rPr>
           <w:b/>
           <w:sz w:val="33"/>
+          <w:highlight w:val="magenta"/>
         </w:rPr>
         <w:t>Year-over-Year Comparison</w:t>
       </w:r>
@@ -30231,7 +30252,219 @@
       <w:pPr>
         <w:spacing w:after="210"/>
         <w:rPr>
-          <w:rFonts w:asciiTheme="minorHAnsi" w:cstheme="minorHAnsi"/>
+          <w:rFonts w:asciiTheme="minorHAnsi" w:eastAsia="Georgia" w:cstheme="minorHAnsi"/>
+        </w:rPr>
+      </w:pPr>
+      <w:r>
+        <w:rPr>
+          <w:rFonts w:asciiTheme="minorHAnsi" w:cstheme="minorHAnsi"/>
+        </w:rPr>
+        <w:drawing>
+          <wp:inline distT="0" distB="0" distL="0" distR="0" wp14:anchorId="18D732B7" wp14:editId="54AB3F8F">
+            <wp:extent cx="5518150" cy="1779270"/>
+            <wp:effectExtent l="0" t="0" r="6350" b="0"/>
+            <wp:docPr id="10" name="Picture 10"/>
+            <wp:cNvGraphicFramePr>
+              <a:graphicFrameLocks xmlns:a="http://schemas.openxmlformats.org/drawingml/2006/main" noChangeAspect="1"/>
+            </wp:cNvGraphicFramePr>
+            <a:graphic xmlns:a="http://schemas.openxmlformats.org/drawingml/2006/main">
+              <a:graphicData uri="http://schemas.openxmlformats.org/drawingml/2006/picture">
+                <pic:pic xmlns:pic="http://schemas.openxmlformats.org/drawingml/2006/picture">
+                  <pic:nvPicPr>
+                    <pic:cNvPr id="1" name=""/>
+                    <pic:cNvPicPr/>
+                  </pic:nvPicPr>
+                  <pic:blipFill>
+                    <a:blip r:embed="rId28"/>
+                    <a:stretch>
+                      <a:fillRect/>
+                    </a:stretch>
+                  </pic:blipFill>
+                  <pic:spPr>
+                    <a:xfrm>
+                      <a:off x="0" y="0"/>
+                      <a:ext cx="5518150" cy="1779270"/>
+                    </a:xfrm>
+                    <a:prstGeom prst="rect">
+                      <a:avLst/>
+                    </a:prstGeom>
+                  </pic:spPr>
+                </pic:pic>
+              </a:graphicData>
+            </a:graphic>
+          </wp:inline>
+        </w:drawing>
+      </w:r>
+    </w:p>
+    <w:p>
+      <w:pPr>
+        <w:spacing w:after="210"/>
+        <w:rPr>
+          <w:noProof/>
+        </w:rPr>
+      </w:pPr>
+      <w:r>
+        <w:rPr>
+          <w:rFonts w:asciiTheme="minorHAnsi" w:cstheme="minorHAnsi"/>
+        </w:rPr>
+        <w:drawing>
+          <wp:inline distT="0" distB="0" distL="0" distR="0" wp14:anchorId="6C4840B6" wp14:editId="3E965EF2">
+            <wp:extent cx="5518150" cy="2550160"/>
+            <wp:effectExtent l="0" t="0" r="6350" b="2540"/>
+            <wp:docPr id="7" name="Picture 7"/>
+            <wp:cNvGraphicFramePr>
+              <a:graphicFrameLocks xmlns:a="http://schemas.openxmlformats.org/drawingml/2006/main" noChangeAspect="1"/>
+            </wp:cNvGraphicFramePr>
+            <a:graphic xmlns:a="http://schemas.openxmlformats.org/drawingml/2006/main">
+              <a:graphicData uri="http://schemas.openxmlformats.org/drawingml/2006/picture">
+                <pic:pic xmlns:pic="http://schemas.openxmlformats.org/drawingml/2006/picture">
+                  <pic:nvPicPr>
+                    <pic:cNvPr id="1" name=""/>
+                    <pic:cNvPicPr/>
+                  </pic:nvPicPr>
+                  <pic:blipFill>
+                    <a:blip r:embed="rId29"/>
+                    <a:stretch>
+                      <a:fillRect/>
+                    </a:stretch>
+                  </pic:blipFill>
+                  <pic:spPr>
+                    <a:xfrm>
+                      <a:off x="0" y="0"/>
+                      <a:ext cx="5518150" cy="2550160"/>
+                    </a:xfrm>
+                    <a:prstGeom prst="rect">
+                      <a:avLst/>
+                    </a:prstGeom>
+                  </pic:spPr>
+                </pic:pic>
+              </a:graphicData>
+            </a:graphic>
+          </wp:inline>
+        </w:drawing>
+      </w:r>
+      <w:r>
+        <w:rPr>
+          <w:noProof/>
+        </w:rPr>
+        <w:t xml:space="preserve"> </w:t>
+      </w:r>
+      <w:r>
+        <w:rPr>
+          <w:rFonts w:asciiTheme="minorHAnsi" w:cstheme="minorHAnsi"/>
+        </w:rPr>
+        <w:lastRenderedPageBreak/>
+        <w:drawing>
+          <wp:inline distT="0" distB="0" distL="0" distR="0" wp14:anchorId="6622ABE8" wp14:editId="290F9DCC">
+            <wp:extent cx="5518150" cy="4077335"/>
+            <wp:effectExtent l="0" t="0" r="6350" b="0"/>
+            <wp:docPr id="8" name="Picture 8"/>
+            <wp:cNvGraphicFramePr>
+              <a:graphicFrameLocks xmlns:a="http://schemas.openxmlformats.org/drawingml/2006/main" noChangeAspect="1"/>
+            </wp:cNvGraphicFramePr>
+            <a:graphic xmlns:a="http://schemas.openxmlformats.org/drawingml/2006/main">
+              <a:graphicData uri="http://schemas.openxmlformats.org/drawingml/2006/picture">
+                <pic:pic xmlns:pic="http://schemas.openxmlformats.org/drawingml/2006/picture">
+                  <pic:nvPicPr>
+                    <pic:cNvPr id="1" name=""/>
+                    <pic:cNvPicPr/>
+                  </pic:nvPicPr>
+                  <pic:blipFill>
+                    <a:blip r:embed="rId30"/>
+                    <a:stretch>
+                      <a:fillRect/>
+                    </a:stretch>
+                  </pic:blipFill>
+                  <pic:spPr>
+                    <a:xfrm>
+                      <a:off x="0" y="0"/>
+                      <a:ext cx="5518150" cy="4077335"/>
+                    </a:xfrm>
+                    <a:prstGeom prst="rect">
+                      <a:avLst/>
+                    </a:prstGeom>
+                  </pic:spPr>
+                </pic:pic>
+              </a:graphicData>
+            </a:graphic>
+          </wp:inline>
+        </w:drawing>
+      </w:r>
+      <w:r>
+        <w:rPr>
+          <w:noProof/>
+        </w:rPr>
+        <w:t xml:space="preserve"> </w:t>
+      </w:r>
+      <w:r>
+        <w:rPr>
+          <w:noProof/>
+        </w:rPr>
+        <w:drawing>
+          <wp:inline distT="0" distB="0" distL="0" distR="0" wp14:anchorId="0DC72515" wp14:editId="295F2A1E">
+            <wp:extent cx="5518150" cy="3721735"/>
+            <wp:effectExtent l="0" t="0" r="6350" b="0"/>
+            <wp:docPr id="9" name="Picture 9"/>
+            <wp:cNvGraphicFramePr>
+              <a:graphicFrameLocks xmlns:a="http://schemas.openxmlformats.org/drawingml/2006/main" noChangeAspect="1"/>
+            </wp:cNvGraphicFramePr>
+            <a:graphic xmlns:a="http://schemas.openxmlformats.org/drawingml/2006/main">
+              <a:graphicData uri="http://schemas.openxmlformats.org/drawingml/2006/picture">
+                <pic:pic xmlns:pic="http://schemas.openxmlformats.org/drawingml/2006/picture">
+                  <pic:nvPicPr>
+                    <pic:cNvPr id="1" name=""/>
+                    <pic:cNvPicPr/>
+                  </pic:nvPicPr>
+                  <pic:blipFill>
+                    <a:blip r:embed="rId31"/>
+                    <a:stretch>
+                      <a:fillRect/>
+                    </a:stretch>
+                  </pic:blipFill>
+                  <pic:spPr>
+                    <a:xfrm>
+                      <a:off x="0" y="0"/>
+                      <a:ext cx="5518150" cy="3721735"/>
+                    </a:xfrm>
+                    <a:prstGeom prst="rect">
+                      <a:avLst/>
+                    </a:prstGeom>
+                  </pic:spPr>
+                </pic:pic>
+              </a:graphicData>
+            </a:graphic>
+          </wp:inline>
+        </w:drawing>
+      </w:r>
+    </w:p>
+    <w:p>
+      <w:pPr>
+        <w:spacing w:after="210"/>
+        <w:rPr>
+          <w:rFonts w:asciiTheme="minorHAnsi" w:cstheme="minorHAnsi"/>
+        </w:rPr>
+      </w:pPr>
+    </w:p>
+    <w:p>
+      <w:pPr>
+        <w:spacing w:before="240" w:line="271" w:lineRule="auto"/>
+      </w:pPr>
+      <w:bookmarkStart w:id="131" w:name="sales_ranking_by_region"/>
+      <w:r>
+        <w:rPr>
+          <w:b/>
+          <w:sz w:val="33"/>
+        </w:rPr>
+        <w:lastRenderedPageBreak/>
+        <w:t>Sales Ranking by Region</w:t>
+      </w:r>
+      <w:bookmarkEnd w:id="131"/>
+    </w:p>
+    <w:p>
+      <w:pPr>
+        <w:spacing w:after="210"/>
+        <w:rPr>
+          <w:rFonts w:asciiTheme="minorHAnsi" w:eastAsia="Georgia" w:cstheme="minorHAnsi"/>
         </w:rPr>
       </w:pPr>
       <w:r>
@@ -30245,21 +30478,21 @@
           <w:rFonts w:asciiTheme="minorHAnsi" w:cstheme="minorHAnsi"/>
         </w:rPr>
         <w:br/>
-        <w:t>month,</w:t>
-      </w:r>
-      <w:r>
-        <w:rPr>
-          <w:rFonts w:asciiTheme="minorHAnsi" w:cstheme="minorHAnsi"/>
-        </w:rPr>
-        <w:br/>
-        <w:t>year,</w:t>
-      </w:r>
-      <w:r>
-        <w:rPr>
-          <w:rFonts w:asciiTheme="minorHAnsi" w:cstheme="minorHAnsi"/>
-        </w:rPr>
-        <w:br/>
-        <w:t>revenue,</w:t>
+        <w:t>region,</w:t>
+      </w:r>
+      <w:r>
+        <w:rPr>
+          <w:rFonts w:asciiTheme="minorHAnsi" w:cstheme="minorHAnsi"/>
+        </w:rPr>
+        <w:br/>
+        <w:t>salesperson,</w:t>
+      </w:r>
+      <w:r>
+        <w:rPr>
+          <w:rFonts w:asciiTheme="minorHAnsi" w:cstheme="minorHAnsi"/>
+        </w:rPr>
+        <w:br/>
+        <w:t>sales,</w:t>
       </w:r>
       <w:r>
         <w:rPr>
@@ -30271,14 +30504,7 @@
         <w:rPr>
           <w:rFonts w:asciiTheme="minorHAnsi" w:eastAsia="Georgia" w:cstheme="minorHAnsi"/>
         </w:rPr>
-        <w:t>LAG(revenue) OVER (PARTITION BY month ORDER BY year) AS prev_year_revenue,</w:t>
-      </w:r>
-      <w:r>
-        <w:rPr>
-          <w:rFonts w:asciiTheme="minorHAnsi" w:cstheme="minorHAnsi"/>
-        </w:rPr>
-        <w:br/>
-        <w:t>(revenue - LAG(revenue) OVER (PARTITION BY month ORDER BY year)) /</w:t>
+        <w:t>RANK() OVER (PARTITION BY region ORDER BY sales DESC) AS region_rank,</w:t>
       </w:r>
       <w:r>
         <w:rPr>
@@ -30290,7 +30516,7 @@
         <w:rPr>
           <w:rFonts w:asciiTheme="minorHAnsi" w:eastAsia="Georgia" w:cstheme="minorHAnsi"/>
         </w:rPr>
-        <w:t>LAG(revenue) OVER (PARTITION BY month ORDER BY year) * 100 AS yoy_growth_percent</w:t>
+        <w:t>RANK() OVER (ORDER BY sales DESC) AS overall_rank</w:t>
       </w:r>
       <w:r>
         <w:rPr>
@@ -30302,92 +30528,195 @@
         <w:rPr>
           <w:rFonts w:asciiTheme="minorHAnsi" w:eastAsia="Georgia" w:cstheme="minorHAnsi"/>
         </w:rPr>
-        <w:t>FROM monthly_sales;</w:t>
-      </w:r>
-    </w:p>
-    <w:p>
-      <w:pPr>
-        <w:spacing w:before="240" w:line="271" w:lineRule="auto"/>
-      </w:pPr>
-      <w:bookmarkStart w:id="131" w:name="sales_ranking_by_region"/>
-      <w:r>
-        <w:rPr>
-          <w:b/>
-          <w:sz w:val="33"/>
-        </w:rPr>
-        <w:t>Sales Ranking by Region</w:t>
-      </w:r>
-      <w:bookmarkEnd w:id="131"/>
-    </w:p>
-    <w:p>
-      <w:pPr>
-        <w:spacing w:after="210"/>
-        <w:rPr>
-          <w:rFonts w:asciiTheme="minorHAnsi" w:cstheme="minorHAnsi"/>
-        </w:rPr>
-      </w:pPr>
-      <w:r>
-        <w:rPr>
-          <w:rFonts w:asciiTheme="minorHAnsi" w:cstheme="minorHAnsi"/>
-        </w:rPr>
-        <w:t>SELECT</w:t>
-      </w:r>
-      <w:r>
-        <w:rPr>
-          <w:rFonts w:asciiTheme="minorHAnsi" w:cstheme="minorHAnsi"/>
-        </w:rPr>
-        <w:br/>
-        <w:t>region,</w:t>
-      </w:r>
-      <w:r>
-        <w:rPr>
-          <w:rFonts w:asciiTheme="minorHAnsi" w:cstheme="minorHAnsi"/>
-        </w:rPr>
-        <w:br/>
-        <w:t>salesperson,</w:t>
-      </w:r>
-      <w:r>
-        <w:rPr>
-          <w:rFonts w:asciiTheme="minorHAnsi" w:cstheme="minorHAnsi"/>
-        </w:rPr>
-        <w:br/>
-        <w:t>sales,</w:t>
-      </w:r>
-      <w:r>
-        <w:rPr>
-          <w:rFonts w:asciiTheme="minorHAnsi" w:cstheme="minorHAnsi"/>
-        </w:rPr>
-        <w:br/>
-      </w:r>
-      <w:r>
-        <w:rPr>
-          <w:rFonts w:asciiTheme="minorHAnsi" w:eastAsia="Georgia" w:cstheme="minorHAnsi"/>
-        </w:rPr>
-        <w:t>RANK() OVER (PARTITION BY region ORDER BY sales DESC) AS region_rank,</w:t>
-      </w:r>
-      <w:r>
-        <w:rPr>
-          <w:rFonts w:asciiTheme="minorHAnsi" w:cstheme="minorHAnsi"/>
-        </w:rPr>
-        <w:br/>
-      </w:r>
-      <w:r>
-        <w:rPr>
-          <w:rFonts w:asciiTheme="minorHAnsi" w:eastAsia="Georgia" w:cstheme="minorHAnsi"/>
-        </w:rPr>
-        <w:t>RANK() OVER (ORDER BY sales DESC) AS overall_rank</w:t>
-      </w:r>
-      <w:r>
-        <w:rPr>
-          <w:rFonts w:asciiTheme="minorHAnsi" w:cstheme="minorHAnsi"/>
-        </w:rPr>
-        <w:br/>
-      </w:r>
-      <w:r>
-        <w:rPr>
-          <w:rFonts w:asciiTheme="minorHAnsi" w:eastAsia="Georgia" w:cstheme="minorHAnsi"/>
-        </w:rPr>
         <w:t>FROM sales_data;</w:t>
+      </w:r>
+    </w:p>
+    <w:p>
+      <w:pPr>
+        <w:spacing w:after="210"/>
+        <w:rPr>
+          <w:rFonts w:asciiTheme="minorHAnsi" w:cstheme="minorHAnsi"/>
+        </w:rPr>
+      </w:pPr>
+      <w:r>
+        <w:rPr>
+          <w:rFonts w:asciiTheme="minorHAnsi" w:cstheme="minorHAnsi"/>
+        </w:rPr>
+        <w:drawing>
+          <wp:inline distT="0" distB="0" distL="0" distR="0" wp14:anchorId="4C66316E" wp14:editId="54BB9278">
+            <wp:extent cx="5518150" cy="3836035"/>
+            <wp:effectExtent l="0" t="0" r="6350" b="0"/>
+            <wp:docPr id="11" name="Picture 11"/>
+            <wp:cNvGraphicFramePr>
+              <a:graphicFrameLocks xmlns:a="http://schemas.openxmlformats.org/drawingml/2006/main" noChangeAspect="1"/>
+            </wp:cNvGraphicFramePr>
+            <a:graphic xmlns:a="http://schemas.openxmlformats.org/drawingml/2006/main">
+              <a:graphicData uri="http://schemas.openxmlformats.org/drawingml/2006/picture">
+                <pic:pic xmlns:pic="http://schemas.openxmlformats.org/drawingml/2006/picture">
+                  <pic:nvPicPr>
+                    <pic:cNvPr id="1" name=""/>
+                    <pic:cNvPicPr/>
+                  </pic:nvPicPr>
+                  <pic:blipFill>
+                    <a:blip r:embed="rId32"/>
+                    <a:stretch>
+                      <a:fillRect/>
+                    </a:stretch>
+                  </pic:blipFill>
+                  <pic:spPr>
+                    <a:xfrm>
+                      <a:off x="0" y="0"/>
+                      <a:ext cx="5518150" cy="3836035"/>
+                    </a:xfrm>
+                    <a:prstGeom prst="rect">
+                      <a:avLst/>
+                    </a:prstGeom>
+                  </pic:spPr>
+                </pic:pic>
+              </a:graphicData>
+            </a:graphic>
+          </wp:inline>
+        </w:drawing>
+      </w:r>
+      <w:r>
+        <w:rPr>
+          <w:noProof/>
+        </w:rPr>
+        <w:t xml:space="preserve"> </w:t>
+      </w:r>
+      <w:r>
+        <w:rPr>
+          <w:rFonts w:asciiTheme="minorHAnsi" w:cstheme="minorHAnsi"/>
+        </w:rPr>
+        <w:lastRenderedPageBreak/>
+        <w:drawing>
+          <wp:inline distT="0" distB="0" distL="0" distR="0" wp14:anchorId="32B14E6B" wp14:editId="544B8706">
+            <wp:extent cx="5518150" cy="3746500"/>
+            <wp:effectExtent l="0" t="0" r="6350" b="6350"/>
+            <wp:docPr id="12" name="Picture 12"/>
+            <wp:cNvGraphicFramePr>
+              <a:graphicFrameLocks xmlns:a="http://schemas.openxmlformats.org/drawingml/2006/main" noChangeAspect="1"/>
+            </wp:cNvGraphicFramePr>
+            <a:graphic xmlns:a="http://schemas.openxmlformats.org/drawingml/2006/main">
+              <a:graphicData uri="http://schemas.openxmlformats.org/drawingml/2006/picture">
+                <pic:pic xmlns:pic="http://schemas.openxmlformats.org/drawingml/2006/picture">
+                  <pic:nvPicPr>
+                    <pic:cNvPr id="1" name=""/>
+                    <pic:cNvPicPr/>
+                  </pic:nvPicPr>
+                  <pic:blipFill>
+                    <a:blip r:embed="rId33"/>
+                    <a:stretch>
+                      <a:fillRect/>
+                    </a:stretch>
+                  </pic:blipFill>
+                  <pic:spPr>
+                    <a:xfrm>
+                      <a:off x="0" y="0"/>
+                      <a:ext cx="5518150" cy="3746500"/>
+                    </a:xfrm>
+                    <a:prstGeom prst="rect">
+                      <a:avLst/>
+                    </a:prstGeom>
+                  </pic:spPr>
+                </pic:pic>
+              </a:graphicData>
+            </a:graphic>
+          </wp:inline>
+        </w:drawing>
+      </w:r>
+      <w:r>
+        <w:rPr>
+          <w:noProof/>
+        </w:rPr>
+        <w:t xml:space="preserve"> </w:t>
+      </w:r>
+      <w:r>
+        <w:rPr>
+          <w:noProof/>
+        </w:rPr>
+        <w:drawing>
+          <wp:inline distT="0" distB="0" distL="0" distR="0" wp14:anchorId="10CACAF7" wp14:editId="7A4A3319">
+            <wp:extent cx="5518150" cy="4021455"/>
+            <wp:effectExtent l="0" t="0" r="6350" b="0"/>
+            <wp:docPr id="13" name="Picture 13"/>
+            <wp:cNvGraphicFramePr>
+              <a:graphicFrameLocks xmlns:a="http://schemas.openxmlformats.org/drawingml/2006/main" noChangeAspect="1"/>
+            </wp:cNvGraphicFramePr>
+            <a:graphic xmlns:a="http://schemas.openxmlformats.org/drawingml/2006/main">
+              <a:graphicData uri="http://schemas.openxmlformats.org/drawingml/2006/picture">
+                <pic:pic xmlns:pic="http://schemas.openxmlformats.org/drawingml/2006/picture">
+                  <pic:nvPicPr>
+                    <pic:cNvPr id="1" name=""/>
+                    <pic:cNvPicPr/>
+                  </pic:nvPicPr>
+                  <pic:blipFill>
+                    <a:blip r:embed="rId34"/>
+                    <a:stretch>
+                      <a:fillRect/>
+                    </a:stretch>
+                  </pic:blipFill>
+                  <pic:spPr>
+                    <a:xfrm>
+                      <a:off x="0" y="0"/>
+                      <a:ext cx="5518150" cy="4021455"/>
+                    </a:xfrm>
+                    <a:prstGeom prst="rect">
+                      <a:avLst/>
+                    </a:prstGeom>
+                  </pic:spPr>
+                </pic:pic>
+              </a:graphicData>
+            </a:graphic>
+          </wp:inline>
+        </w:drawing>
+      </w:r>
+      <w:r>
+        <w:rPr>
+          <w:noProof/>
+        </w:rPr>
+        <w:lastRenderedPageBreak/>
+        <w:t xml:space="preserve"> </w:t>
+      </w:r>
+      <w:r>
+        <w:rPr>
+          <w:noProof/>
+        </w:rPr>
+        <w:drawing>
+          <wp:inline distT="0" distB="0" distL="0" distR="0" wp14:anchorId="37BB7CDB" wp14:editId="5FE86DEA">
+            <wp:extent cx="5518150" cy="4087495"/>
+            <wp:effectExtent l="0" t="0" r="6350" b="8255"/>
+            <wp:docPr id="14" name="Picture 14"/>
+            <wp:cNvGraphicFramePr>
+              <a:graphicFrameLocks xmlns:a="http://schemas.openxmlformats.org/drawingml/2006/main" noChangeAspect="1"/>
+            </wp:cNvGraphicFramePr>
+            <a:graphic xmlns:a="http://schemas.openxmlformats.org/drawingml/2006/main">
+              <a:graphicData uri="http://schemas.openxmlformats.org/drawingml/2006/picture">
+                <pic:pic xmlns:pic="http://schemas.openxmlformats.org/drawingml/2006/picture">
+                  <pic:nvPicPr>
+                    <pic:cNvPr id="1" name=""/>
+                    <pic:cNvPicPr/>
+                  </pic:nvPicPr>
+                  <pic:blipFill>
+                    <a:blip r:embed="rId35"/>
+                    <a:stretch>
+                      <a:fillRect/>
+                    </a:stretch>
+                  </pic:blipFill>
+                  <pic:spPr>
+                    <a:xfrm>
+                      <a:off x="0" y="0"/>
+                      <a:ext cx="5518150" cy="4087495"/>
+                    </a:xfrm>
+                    <a:prstGeom prst="rect">
+                      <a:avLst/>
+                    </a:prstGeom>
+                  </pic:spPr>
+                </pic:pic>
+              </a:graphicData>
+            </a:graphic>
+          </wp:inline>
+        </w:drawing>
       </w:r>
     </w:p>
     <w:p>
@@ -30504,202 +30833,395 @@
           <w:b/>
           <w:sz w:val="33"/>
         </w:rPr>
+        <w:t>Question 1: Second Highest Salary</w:t>
+      </w:r>
+      <w:bookmarkEnd w:id="135"/>
+    </w:p>
+    <w:p>
+      <w:pPr>
+        <w:spacing w:after="210"/>
+        <w:rPr>
+          <w:rFonts w:asciiTheme="minorHAnsi" w:cstheme="minorHAnsi"/>
+        </w:rPr>
+      </w:pPr>
+      <w:r>
+        <w:rPr>
+          <w:rFonts w:asciiTheme="minorHAnsi" w:cstheme="minorHAnsi"/>
+          <w:b/>
+        </w:rPr>
+        <w:t>Problem:</w:t>
+      </w:r>
+      <w:r>
+        <w:rPr>
+          <w:rFonts w:asciiTheme="minorHAnsi" w:cstheme="minorHAnsi"/>
+        </w:rPr>
+        <w:t xml:space="preserve"> Find the second highest salary.</w:t>
+      </w:r>
+    </w:p>
+    <w:p>
+      <w:pPr>
+        <w:spacing w:after="210"/>
+        <w:rPr>
+          <w:rFonts w:asciiTheme="minorHAnsi" w:cstheme="minorHAnsi"/>
+        </w:rPr>
+      </w:pPr>
+      <w:r>
+        <w:rPr>
+          <w:rFonts w:asciiTheme="minorHAnsi" w:cstheme="minorHAnsi"/>
+          <w:b/>
+        </w:rPr>
+        <w:t>Solution 1: Using OFFSET</w:t>
+      </w:r>
+    </w:p>
+    <w:p>
+      <w:pPr>
+        <w:spacing w:after="210"/>
+        <w:rPr>
+          <w:rFonts w:asciiTheme="minorHAnsi" w:cstheme="minorHAnsi"/>
+        </w:rPr>
+      </w:pPr>
+      <w:r>
+        <w:rPr>
+          <w:rFonts w:asciiTheme="minorHAnsi" w:cstheme="minorHAnsi"/>
+        </w:rPr>
+        <w:t>SELECT DISTINCT salary</w:t>
+      </w:r>
+      <w:r>
+        <w:rPr>
+          <w:rFonts w:asciiTheme="minorHAnsi" w:cstheme="minorHAnsi"/>
+        </w:rPr>
+        <w:br/>
+        <w:t>FROM employees</w:t>
+      </w:r>
+      <w:r>
+        <w:rPr>
+          <w:rFonts w:asciiTheme="minorHAnsi" w:cstheme="minorHAnsi"/>
+        </w:rPr>
+        <w:br/>
+      </w:r>
+      <w:r>
+        <w:rPr>
+          <w:rFonts w:asciiTheme="minorHAnsi" w:cstheme="minorHAnsi"/>
+        </w:rPr>
         <w:lastRenderedPageBreak/>
-        <w:t>Question 1: Second Highest Salary</w:t>
-      </w:r>
-      <w:bookmarkEnd w:id="135"/>
-    </w:p>
-    <w:p>
-      <w:pPr>
-        <w:spacing w:after="210"/>
-        <w:rPr>
-          <w:rFonts w:asciiTheme="minorHAnsi" w:cstheme="minorHAnsi"/>
-        </w:rPr>
-      </w:pPr>
-      <w:r>
-        <w:rPr>
-          <w:rFonts w:asciiTheme="minorHAnsi" w:cstheme="minorHAnsi"/>
+        <w:t>ORDER BY salary DESC</w:t>
+      </w:r>
+      <w:r>
+        <w:rPr>
+          <w:rFonts w:asciiTheme="minorHAnsi" w:cstheme="minorHAnsi"/>
+        </w:rPr>
+        <w:br/>
+        <w:t>LIMIT 1 OFFSET 1;</w:t>
+      </w:r>
+    </w:p>
+    <w:p>
+      <w:pPr>
+        <w:spacing w:after="210"/>
+        <w:rPr>
+          <w:rFonts w:asciiTheme="minorHAnsi" w:cstheme="minorHAnsi"/>
+        </w:rPr>
+      </w:pPr>
+      <w:r>
+        <w:rPr>
+          <w:rFonts w:asciiTheme="minorHAnsi" w:cstheme="minorHAnsi"/>
+          <w:b/>
+        </w:rPr>
+        <w:t>Solution 2: Using Subquery</w:t>
+      </w:r>
+    </w:p>
+    <w:p>
+      <w:pPr>
+        <w:spacing w:after="210"/>
+        <w:rPr>
+          <w:rFonts w:asciiTheme="minorHAnsi" w:cstheme="minorHAnsi"/>
+        </w:rPr>
+      </w:pPr>
+      <w:r>
+        <w:rPr>
+          <w:rFonts w:asciiTheme="minorHAnsi" w:cstheme="minorHAnsi"/>
+        </w:rPr>
+        <w:t>SELECT MAX(salary)</w:t>
+      </w:r>
+      <w:r>
+        <w:rPr>
+          <w:rFonts w:asciiTheme="minorHAnsi" w:cstheme="minorHAnsi"/>
+        </w:rPr>
+        <w:br/>
+        <w:t>FROM employees</w:t>
+      </w:r>
+      <w:r>
+        <w:rPr>
+          <w:rFonts w:asciiTheme="minorHAnsi" w:cstheme="minorHAnsi"/>
+        </w:rPr>
+        <w:br/>
+        <w:t>WHERE salary &lt; (SELECT MAX(salary) FROM employees);</w:t>
+      </w:r>
+    </w:p>
+    <w:p>
+      <w:pPr>
+        <w:spacing w:after="210"/>
+        <w:rPr>
+          <w:rFonts w:asciiTheme="minorHAnsi" w:cstheme="minorHAnsi"/>
+        </w:rPr>
+      </w:pPr>
+      <w:r>
+        <w:rPr>
+          <w:rFonts w:asciiTheme="minorHAnsi" w:cstheme="minorHAnsi"/>
+          <w:b/>
+        </w:rPr>
+        <w:t>Solution 3: Using Window Function</w:t>
+      </w:r>
+    </w:p>
+    <w:p>
+      <w:pPr>
+        <w:spacing w:after="210"/>
+        <w:rPr>
+          <w:rFonts w:asciiTheme="minorHAnsi" w:cstheme="minorHAnsi"/>
+        </w:rPr>
+      </w:pPr>
+      <w:r>
+        <w:rPr>
+          <w:rFonts w:asciiTheme="minorHAnsi" w:cstheme="minorHAnsi"/>
+        </w:rPr>
+        <w:t>SELECT salary</w:t>
+      </w:r>
+      <w:r>
+        <w:rPr>
+          <w:rFonts w:asciiTheme="minorHAnsi" w:cstheme="minorHAnsi"/>
+        </w:rPr>
+        <w:br/>
+        <w:t>FROM (</w:t>
+      </w:r>
+      <w:r>
+        <w:rPr>
+          <w:rFonts w:asciiTheme="minorHAnsi" w:cstheme="minorHAnsi"/>
+        </w:rPr>
+        <w:br/>
+        <w:t>SELECT salary, RANK() OVER (ORDER BY salary DESC) AS rnk</w:t>
+      </w:r>
+      <w:r>
+        <w:rPr>
+          <w:rFonts w:asciiTheme="minorHAnsi" w:cstheme="minorHAnsi"/>
+        </w:rPr>
+        <w:br/>
+        <w:t>FROM employees</w:t>
+      </w:r>
+      <w:r>
+        <w:rPr>
+          <w:rFonts w:asciiTheme="minorHAnsi" w:cstheme="minorHAnsi"/>
+        </w:rPr>
+        <w:br/>
+        <w:t>) ranked</w:t>
+      </w:r>
+      <w:r>
+        <w:rPr>
+          <w:rFonts w:asciiTheme="minorHAnsi" w:cstheme="minorHAnsi"/>
+        </w:rPr>
+        <w:br/>
+        <w:t>WHERE rnk = 2;</w:t>
+      </w:r>
+    </w:p>
+    <w:p>
+      <w:pPr>
+        <w:spacing w:before="240" w:line="271" w:lineRule="auto"/>
+      </w:pPr>
+      <w:bookmarkStart w:id="136" w:name="question_2_find_duplicate_records"/>
+      <w:r>
+        <w:rPr>
+          <w:b/>
+          <w:sz w:val="33"/>
+        </w:rPr>
+        <w:t>Question 2: Find Duplicate Records</w:t>
+      </w:r>
+      <w:bookmarkEnd w:id="136"/>
+    </w:p>
+    <w:p>
+      <w:pPr>
+        <w:spacing w:after="210"/>
+      </w:pPr>
+      <w:r>
+        <w:rPr>
           <w:b/>
         </w:rPr>
         <w:t>Problem:</w:t>
       </w:r>
       <w:r>
-        <w:rPr>
-          <w:rFonts w:asciiTheme="minorHAnsi" w:cstheme="minorHAnsi"/>
-        </w:rPr>
-        <w:t xml:space="preserve"> Find the second highest salary.</w:t>
-      </w:r>
-    </w:p>
-    <w:p>
-      <w:pPr>
-        <w:spacing w:after="210"/>
-        <w:rPr>
-          <w:rFonts w:asciiTheme="minorHAnsi" w:cstheme="minorHAnsi"/>
-        </w:rPr>
-      </w:pPr>
-      <w:r>
-        <w:rPr>
-          <w:rFonts w:asciiTheme="minorHAnsi" w:cstheme="minorHAnsi"/>
-          <w:b/>
-        </w:rPr>
-        <w:t>Solution 1: Using OFFSET</w:t>
-      </w:r>
-    </w:p>
-    <w:p>
-      <w:pPr>
-        <w:spacing w:after="210"/>
-        <w:rPr>
-          <w:rFonts w:asciiTheme="minorHAnsi" w:cstheme="minorHAnsi"/>
-        </w:rPr>
-      </w:pPr>
-      <w:r>
-        <w:rPr>
-          <w:rFonts w:asciiTheme="minorHAnsi" w:cstheme="minorHAnsi"/>
-        </w:rPr>
-        <w:t>SELECT DISTINCT salary</w:t>
-      </w:r>
-      <w:r>
-        <w:rPr>
-          <w:rFonts w:asciiTheme="minorHAnsi" w:cstheme="minorHAnsi"/>
-        </w:rPr>
-        <w:br/>
+        <w:t xml:space="preserve"> Find employees with duplicate names.</w:t>
+      </w:r>
+    </w:p>
+    <w:p>
+      <w:pPr>
+        <w:spacing w:before="240" w:line="271" w:lineRule="auto"/>
+      </w:pPr>
+      <w:bookmarkStart w:id="137" w:name="question_3_delete_duplicate_rows_eb4771"/>
+      <w:r>
+        <w:t>SELECT name, COUNT(*) AS name_count</w:t>
+      </w:r>
+    </w:p>
+    <w:p>
+      <w:pPr>
+        <w:spacing w:before="240" w:line="271" w:lineRule="auto"/>
+      </w:pPr>
+      <w:r>
         <w:t>FROM employees</w:t>
       </w:r>
-      <w:r>
-        <w:rPr>
-          <w:rFonts w:asciiTheme="minorHAnsi" w:cstheme="minorHAnsi"/>
-        </w:rPr>
-        <w:br/>
-        <w:t>ORDER BY salary DESC</w:t>
-      </w:r>
-      <w:r>
-        <w:rPr>
-          <w:rFonts w:asciiTheme="minorHAnsi" w:cstheme="minorHAnsi"/>
-        </w:rPr>
-        <w:br/>
-        <w:t>LIMIT 1 OFFSET 1;</w:t>
-      </w:r>
-    </w:p>
-    <w:p>
-      <w:pPr>
-        <w:spacing w:after="210"/>
-        <w:rPr>
-          <w:rFonts w:asciiTheme="minorHAnsi" w:cstheme="minorHAnsi"/>
-        </w:rPr>
-      </w:pPr>
-      <w:r>
-        <w:rPr>
-          <w:rFonts w:asciiTheme="minorHAnsi" w:cstheme="minorHAnsi"/>
-          <w:b/>
-        </w:rPr>
-        <w:t>Solution 2: Using Subquery</w:t>
-      </w:r>
-    </w:p>
-    <w:p>
-      <w:pPr>
-        <w:spacing w:after="210"/>
-        <w:rPr>
-          <w:rFonts w:asciiTheme="minorHAnsi" w:cstheme="minorHAnsi"/>
-        </w:rPr>
-      </w:pPr>
-      <w:r>
-        <w:rPr>
-          <w:rFonts w:asciiTheme="minorHAnsi" w:cstheme="minorHAnsi"/>
-        </w:rPr>
-        <w:t>SELECT MAX(salary)</w:t>
-      </w:r>
-      <w:r>
-        <w:rPr>
-          <w:rFonts w:asciiTheme="minorHAnsi" w:cstheme="minorHAnsi"/>
-        </w:rPr>
+    </w:p>
+    <w:p>
+      <w:pPr>
+        <w:spacing w:before="240" w:line="271" w:lineRule="auto"/>
+      </w:pPr>
+      <w:r>
+        <w:t>GROUP BY name</w:t>
+      </w:r>
+    </w:p>
+    <w:p>
+      <w:pPr>
+        <w:spacing w:before="240" w:line="271" w:lineRule="auto"/>
+      </w:pPr>
+      <w:r>
+        <w:t>HAVING COUNT(*) &gt; 1;</w:t>
+      </w:r>
+    </w:p>
+    <w:p>
+      <w:pPr>
+        <w:spacing w:before="240" w:line="271" w:lineRule="auto"/>
+      </w:pPr>
+      <w:r>
+        <w:rPr>
+          <w:b/>
+          <w:sz w:val="33"/>
+        </w:rPr>
+        <w:t>Question 3: Delete Duplicate Rows (Keep One)</w:t>
+      </w:r>
+      <w:bookmarkEnd w:id="137"/>
+    </w:p>
+    <w:p>
+      <w:pPr>
+        <w:spacing w:after="210"/>
+      </w:pPr>
+      <w:r>
+        <w:rPr>
+          <w:b/>
+        </w:rPr>
+        <w:t>Problem:</w:t>
+      </w:r>
+      <w:r>
+        <w:t xml:space="preserve"> Remove duplicates, keeping only the first occurrence.</w:t>
+      </w:r>
+    </w:p>
+    <w:p>
+      <w:pPr>
+        <w:spacing w:after="210"/>
+      </w:pPr>
+      <w:r>
+        <w:t>DELETE FROM employees</w:t>
+      </w:r>
+      <w:r>
+        <w:br/>
+      </w:r>
+      <w:r>
+        <w:rPr>
+          <w:rFonts w:eastAsia="Georgia" w:hAnsi="Georgia" w:cs="Georgia"/>
+        </w:rPr>
+        <w:t>WHERE employee_id NOT IN (</w:t>
+      </w:r>
+      <w:r>
+        <w:br/>
+      </w:r>
+      <w:r>
+        <w:rPr>
+          <w:rFonts w:eastAsia="Georgia" w:hAnsi="Georgia" w:cs="Georgia"/>
+        </w:rPr>
+        <w:t>SELECT MIN(employee_id)</w:t>
+      </w:r>
+      <w:r>
         <w:br/>
         <w:t>FROM employees</w:t>
       </w:r>
       <w:r>
-        <w:rPr>
-          <w:rFonts w:asciiTheme="minorHAnsi" w:cstheme="minorHAnsi"/>
-        </w:rPr>
-        <w:br/>
-        <w:t>WHERE salary &lt; (SELECT MAX(salary) FROM employees);</w:t>
-      </w:r>
-    </w:p>
-    <w:p>
-      <w:pPr>
-        <w:spacing w:after="210"/>
-        <w:rPr>
-          <w:rFonts w:asciiTheme="minorHAnsi" w:cstheme="minorHAnsi"/>
-        </w:rPr>
-      </w:pPr>
-      <w:r>
-        <w:rPr>
-          <w:rFonts w:asciiTheme="minorHAnsi" w:cstheme="minorHAnsi"/>
-          <w:b/>
-        </w:rPr>
-        <w:t>Solution 3: Using Window Function</w:t>
-      </w:r>
-    </w:p>
-    <w:p>
-      <w:pPr>
-        <w:spacing w:after="210"/>
-        <w:rPr>
-          <w:rFonts w:asciiTheme="minorHAnsi" w:cstheme="minorHAnsi"/>
-        </w:rPr>
-      </w:pPr>
-      <w:r>
-        <w:rPr>
-          <w:rFonts w:asciiTheme="minorHAnsi" w:cstheme="minorHAnsi"/>
-        </w:rPr>
+        <w:br/>
+        <w:t>GROUP BY name</w:t>
+      </w:r>
+      <w:r>
+        <w:br/>
+        <w:t>);</w:t>
+      </w:r>
+    </w:p>
+    <w:p>
+      <w:pPr>
+        <w:spacing w:before="240" w:line="271" w:lineRule="auto"/>
+      </w:pPr>
+      <w:bookmarkStart w:id="138" w:name="question_4_nth_highest_salary"/>
+      <w:r>
+        <w:rPr>
+          <w:b/>
+          <w:sz w:val="33"/>
+        </w:rPr>
+        <w:t>Question 4: Nth Highest Salary</w:t>
+      </w:r>
+      <w:bookmarkEnd w:id="138"/>
+    </w:p>
+    <w:p>
+      <w:pPr>
+        <w:spacing w:after="210"/>
+      </w:pPr>
+      <w:r>
+        <w:rPr>
+          <w:b/>
+        </w:rPr>
+        <w:t>Problem:</w:t>
+      </w:r>
+      <w:r>
+        <w:t xml:space="preserve"> Find the Nth highest salary (general solution).</w:t>
+      </w:r>
+    </w:p>
+    <w:p>
+      <w:pPr>
+        <w:spacing w:after="210"/>
+      </w:pPr>
+      <w:r>
         <w:t>SELECT salary</w:t>
       </w:r>
       <w:r>
-        <w:rPr>
-          <w:rFonts w:asciiTheme="minorHAnsi" w:cstheme="minorHAnsi"/>
-        </w:rPr>
         <w:br/>
         <w:t>FROM (</w:t>
       </w:r>
       <w:r>
-        <w:rPr>
-          <w:rFonts w:asciiTheme="minorHAnsi" w:cstheme="minorHAnsi"/>
-        </w:rPr>
-        <w:br/>
-        <w:t>SELECT salary, RANK() OVER (ORDER BY salary DESC) AS rnk</w:t>
-      </w:r>
-      <w:r>
-        <w:rPr>
-          <w:rFonts w:asciiTheme="minorHAnsi" w:cstheme="minorHAnsi"/>
-        </w:rPr>
+        <w:br/>
+      </w:r>
+      <w:r>
+        <w:rPr>
+          <w:rFonts w:eastAsia="Georgia" w:hAnsi="Georgia" w:cs="Georgia"/>
+        </w:rPr>
+        <w:t>SELECT DISTINCT salary, DENSE_RANK() OVER (ORDER BY salary DESC) AS rnk</w:t>
+      </w:r>
+      <w:r>
         <w:br/>
         <w:t>FROM employees</w:t>
       </w:r>
       <w:r>
-        <w:rPr>
-          <w:rFonts w:asciiTheme="minorHAnsi" w:cstheme="minorHAnsi"/>
-        </w:rPr>
         <w:br/>
         <w:t>) ranked</w:t>
       </w:r>
       <w:r>
-        <w:rPr>
-          <w:rFonts w:asciiTheme="minorHAnsi" w:cstheme="minorHAnsi"/>
-        </w:rPr>
-        <w:br/>
-        <w:t>WHERE rnk = 2;</w:t>
+        <w:br/>
+        <w:t>WHERE rnk = N; -- Replace N with the value you want</w:t>
       </w:r>
     </w:p>
     <w:p>
       <w:pPr>
         <w:spacing w:before="240" w:line="271" w:lineRule="auto"/>
       </w:pPr>
-      <w:bookmarkStart w:id="136" w:name="question_2_find_duplicate_records"/>
+      <w:bookmarkStart w:id="139" w:name="question_5_employees_with_above_a_26cca2"/>
       <w:r>
         <w:rPr>
           <w:b/>
           <w:sz w:val="33"/>
         </w:rPr>
-        <w:t>Question 2: Find Duplicate Records</w:t>
-      </w:r>
-      <w:bookmarkEnd w:id="136"/>
+        <w:lastRenderedPageBreak/>
+        <w:t>Question 5: Employees with Above Average Salary</w:t>
+      </w:r>
+      <w:bookmarkEnd w:id="139"/>
     </w:p>
     <w:p>
       <w:pPr>
@@ -30712,54 +31234,294 @@
         <w:t>Problem:</w:t>
       </w:r>
       <w:r>
-        <w:t xml:space="preserve"> Find employees with duplicate names.</w:t>
+        <w:t xml:space="preserve"> Find employees earning more than the average.</w:t>
+      </w:r>
+    </w:p>
+    <w:p>
+      <w:pPr>
+        <w:spacing w:after="210"/>
+      </w:pPr>
+      <w:r>
+        <w:t>SELECT name, salary, department</w:t>
+      </w:r>
+      <w:r>
+        <w:br/>
+        <w:t>FROM employees</w:t>
+      </w:r>
+      <w:r>
+        <w:br/>
+        <w:t>WHERE salary &gt; (SELECT AVG(salary) FROM employees);</w:t>
       </w:r>
     </w:p>
     <w:p>
       <w:pPr>
         <w:spacing w:before="240" w:line="271" w:lineRule="auto"/>
       </w:pPr>
-      <w:bookmarkStart w:id="137" w:name="question_3_delete_duplicate_rows_eb4771"/>
-      <w:r>
-        <w:t>SELECT name, COUNT(*) AS name_count</w:t>
+      <w:bookmarkStart w:id="140" w:name="question_6_department_with_highes_2a20af"/>
+      <w:r>
+        <w:rPr>
+          <w:b/>
+          <w:sz w:val="33"/>
+        </w:rPr>
+        <w:t>Question 6: Department with Highest Average Salary</w:t>
+      </w:r>
+      <w:bookmarkEnd w:id="140"/>
+    </w:p>
+    <w:p>
+      <w:pPr>
+        <w:spacing w:after="210"/>
+      </w:pPr>
+      <w:r>
+        <w:rPr>
+          <w:b/>
+        </w:rPr>
+        <w:t>Problem:</w:t>
+      </w:r>
+      <w:r>
+        <w:t xml:space="preserve"> Which department has the highest average salary?</w:t>
+      </w:r>
+    </w:p>
+    <w:p>
+      <w:pPr>
+        <w:spacing w:after="210"/>
+      </w:pPr>
+      <w:r>
+        <w:rPr>
+          <w:rFonts w:eastAsia="Georgia" w:hAnsi="Georgia" w:cs="Georgia"/>
+        </w:rPr>
+        <w:t>SELECT department, AVG(salary) AS avg_sal</w:t>
+      </w:r>
+      <w:r>
+        <w:br/>
+        <w:t>FROM employees</w:t>
+      </w:r>
+      <w:r>
+        <w:br/>
+        <w:t>GROUP BY department</w:t>
+      </w:r>
+      <w:r>
+        <w:br/>
+      </w:r>
+      <w:r>
+        <w:rPr>
+          <w:rFonts w:eastAsia="Georgia" w:hAnsi="Georgia" w:cs="Georgia"/>
+        </w:rPr>
+        <w:t>ORDER BY avg_sal DESC</w:t>
+      </w:r>
+      <w:r>
+        <w:br/>
+        <w:t>LIMIT 1;</w:t>
       </w:r>
     </w:p>
     <w:p>
       <w:pPr>
         <w:spacing w:before="240" w:line="271" w:lineRule="auto"/>
       </w:pPr>
-      <w:r>
-        <w:t>FROM employees</w:t>
-      </w:r>
+      <w:bookmarkStart w:id="141" w:name="real_world_sql_scenarios"/>
+      <w:r>
+        <w:rPr>
+          <w:b/>
+          <w:sz w:val="42"/>
+        </w:rPr>
+        <w:t>Real-World SQL Scenarios</w:t>
+      </w:r>
+      <w:bookmarkEnd w:id="141"/>
     </w:p>
     <w:p>
       <w:pPr>
         <w:spacing w:before="240" w:line="271" w:lineRule="auto"/>
       </w:pPr>
-      <w:r>
-        <w:t>GROUP BY name</w:t>
+      <w:bookmarkStart w:id="142" w:name="scenario_1_customer_lifetime_value"/>
+      <w:r>
+        <w:rPr>
+          <w:b/>
+          <w:sz w:val="33"/>
+        </w:rPr>
+        <w:t>Scenario 1: Customer Lifetime Value</w:t>
+      </w:r>
+      <w:bookmarkEnd w:id="142"/>
+    </w:p>
+    <w:p>
+      <w:pPr>
+        <w:spacing w:after="210"/>
+      </w:pPr>
+      <w:r>
+        <w:rPr>
+          <w:b/>
+        </w:rPr>
+        <w:t>Problem:</w:t>
+      </w:r>
+      <w:r>
+        <w:t xml:space="preserve"> Calculate total spending per customer.</w:t>
+      </w:r>
+    </w:p>
+    <w:p>
+      <w:pPr>
+        <w:spacing w:after="210"/>
+      </w:pPr>
+      <w:r>
+        <w:t>SELECT</w:t>
+      </w:r>
+      <w:r>
+        <w:br/>
+      </w:r>
+      <w:r>
+        <w:rPr>
+          <w:rFonts w:eastAsia="Georgia" w:hAnsi="Georgia" w:cs="Georgia"/>
+        </w:rPr>
+        <w:t>customer_id,</w:t>
+      </w:r>
+      <w:r>
+        <w:br/>
+      </w:r>
+      <w:r>
+        <w:rPr>
+          <w:rFonts w:eastAsia="Georgia" w:hAnsi="Georgia" w:cs="Georgia"/>
+        </w:rPr>
+        <w:t>customer_name,</w:t>
+      </w:r>
+      <w:r>
+        <w:br/>
+      </w:r>
+      <w:r>
+        <w:rPr>
+          <w:rFonts w:eastAsia="Georgia" w:hAnsi="Georgia" w:cs="Georgia"/>
+        </w:rPr>
+        <w:t>COUNT(order_id) AS order_count,</w:t>
+      </w:r>
+      <w:r>
+        <w:br/>
+      </w:r>
+      <w:r>
+        <w:rPr>
+          <w:rFonts w:eastAsia="Georgia" w:hAnsi="Georgia" w:cs="Georgia"/>
+        </w:rPr>
+        <w:t>SUM(order_amount) AS total_spent,</w:t>
+      </w:r>
+      <w:r>
+        <w:br/>
+      </w:r>
+      <w:r>
+        <w:rPr>
+          <w:rFonts w:eastAsia="Georgia" w:hAnsi="Georgia" w:cs="Georgia"/>
+        </w:rPr>
+        <w:t>AVG(order_amount) AS avg_order_value</w:t>
+      </w:r>
+      <w:r>
+        <w:br/>
+        <w:t>FROM orders</w:t>
+      </w:r>
+      <w:r>
+        <w:br/>
+      </w:r>
+      <w:r>
+        <w:rPr>
+          <w:rFonts w:eastAsia="Georgia" w:hAnsi="Georgia" w:cs="Georgia"/>
+        </w:rPr>
+        <w:t>GROUP BY customer_id, customer_name</w:t>
+      </w:r>
+      <w:r>
+        <w:br/>
+      </w:r>
+      <w:r>
+        <w:rPr>
+          <w:rFonts w:eastAsia="Georgia" w:hAnsi="Georgia" w:cs="Georgia"/>
+        </w:rPr>
+        <w:t>ORDER BY total_spent DESC;</w:t>
       </w:r>
     </w:p>
     <w:p>
       <w:pPr>
         <w:spacing w:before="240" w:line="271" w:lineRule="auto"/>
       </w:pPr>
-      <w:r>
-        <w:t>HAVING COUNT(*) &gt; 1;</w:t>
+      <w:bookmarkStart w:id="143" w:name="scenario_2_monthly_growth_rate"/>
+      <w:r>
+        <w:rPr>
+          <w:b/>
+          <w:sz w:val="33"/>
+        </w:rPr>
+        <w:t>Scenario 2: Monthly Growth Rate</w:t>
+      </w:r>
+      <w:bookmarkEnd w:id="143"/>
+    </w:p>
+    <w:p>
+      <w:pPr>
+        <w:spacing w:after="210"/>
+      </w:pPr>
+      <w:r>
+        <w:rPr>
+          <w:b/>
+        </w:rPr>
+        <w:t>Problem:</w:t>
+      </w:r>
+      <w:r>
+        <w:t xml:space="preserve"> Show month-on-month sales growth.</w:t>
+      </w:r>
+    </w:p>
+    <w:p>
+      <w:pPr>
+        <w:spacing w:after="210"/>
+      </w:pPr>
+      <w:r>
+        <w:t>SELECT</w:t>
+      </w:r>
+      <w:r>
+        <w:br/>
+        <w:t>month,</w:t>
+      </w:r>
+      <w:r>
+        <w:br/>
+        <w:t>revenue,</w:t>
+      </w:r>
+      <w:r>
+        <w:br/>
+      </w:r>
+      <w:r>
+        <w:rPr>
+          <w:rFonts w:eastAsia="Georgia" w:hAnsi="Georgia" w:cs="Georgia"/>
+        </w:rPr>
+        <w:t>LAG(revenue) OVER (ORDER BY month) AS prev_month_revenue,</w:t>
+      </w:r>
+      <w:r>
+        <w:br/>
+        <w:t>ROUND(((revenue - LAG(revenue) OVER (ORDER BY month)) /</w:t>
+      </w:r>
+      <w:r>
+        <w:br/>
+      </w:r>
+      <w:r>
+        <w:rPr>
+          <w:rFonts w:eastAsia="Georgia" w:hAnsi="Georgia" w:cs="Georgia"/>
+        </w:rPr>
+        <w:t>LAG(revenue) OVER (ORDER BY month)) * 100, 2) AS growth_percent</w:t>
+      </w:r>
+      <w:r>
+        <w:br/>
+      </w:r>
+      <w:r>
+        <w:rPr>
+          <w:rFonts w:eastAsia="Georgia" w:hAnsi="Georgia" w:cs="Georgia"/>
+        </w:rPr>
+        <w:t>FROM monthly_sales</w:t>
+      </w:r>
+      <w:r>
+        <w:br/>
+        <w:t>ORDER BY month;</w:t>
       </w:r>
     </w:p>
     <w:p>
       <w:pPr>
         <w:spacing w:before="240" w:line="271" w:lineRule="auto"/>
       </w:pPr>
+      <w:bookmarkStart w:id="144" w:name="scenario_3_cohort_analysis"/>
       <w:r>
         <w:rPr>
           <w:b/>
           <w:sz w:val="33"/>
         </w:rPr>
-        <w:t>Question 3: Delete Duplicate Rows (Keep One)</w:t>
-      </w:r>
-      <w:bookmarkEnd w:id="137"/>
+        <w:t>Scenario 3: Cohort Analysis</w:t>
+      </w:r>
+      <w:bookmarkEnd w:id="144"/>
     </w:p>
     <w:p>
       <w:pPr>
@@ -30772,15 +31534,20 @@
         <w:t>Problem:</w:t>
       </w:r>
       <w:r>
-        <w:t xml:space="preserve"> Remove duplicates, keeping only the first occurrence.</w:t>
-      </w:r>
-    </w:p>
-    <w:p>
-      <w:pPr>
-        <w:spacing w:after="210"/>
-      </w:pPr>
-      <w:r>
-        <w:t>DELETE FROM employees</w:t>
+        <w:t xml:space="preserve"> Track user retention by signup month.</w:t>
+      </w:r>
+    </w:p>
+    <w:p>
+      <w:pPr>
+        <w:spacing w:after="210"/>
+      </w:pPr>
+      <w:r>
+        <w:lastRenderedPageBreak/>
+        <w:t>WITH cohorts AS (</w:t>
+      </w:r>
+      <w:r>
+        <w:br/>
+        <w:t>SELECT</w:t>
       </w:r>
       <w:r>
         <w:br/>
@@ -30789,7 +31556,7 @@
         <w:rPr>
           <w:rFonts w:eastAsia="Georgia" w:hAnsi="Georgia" w:cs="Georgia"/>
         </w:rPr>
-        <w:t>WHERE employee_id NOT IN (</w:t>
+        <w:t>DATE_TRUNC('month', signup_date) AS cohort_month,</w:t>
       </w:r>
       <w:r>
         <w:br/>
@@ -30798,34 +31565,136 @@
         <w:rPr>
           <w:rFonts w:eastAsia="Georgia" w:hAnsi="Georgia" w:cs="Georgia"/>
         </w:rPr>
-        <w:t>SELECT MIN(employee_id)</w:t>
-      </w:r>
-      <w:r>
-        <w:br/>
-        <w:t>FROM employees</w:t>
-      </w:r>
-      <w:r>
-        <w:br/>
-        <w:t>GROUP BY name</w:t>
-      </w:r>
-      <w:r>
-        <w:br/>
-        <w:t>);</w:t>
+        <w:t>user_id</w:t>
+      </w:r>
+      <w:r>
+        <w:br/>
+        <w:t>FROM users</w:t>
+      </w:r>
+      <w:r>
+        <w:br/>
+        <w:t>),</w:t>
+      </w:r>
+      <w:r>
+        <w:br/>
+      </w:r>
+      <w:r>
+        <w:rPr>
+          <w:rFonts w:eastAsia="Georgia" w:hAnsi="Georgia" w:cs="Georgia"/>
+        </w:rPr>
+        <w:t>user_activity AS (</w:t>
+      </w:r>
+      <w:r>
+        <w:br/>
+        <w:t>SELECT</w:t>
+      </w:r>
+      <w:r>
+        <w:br/>
+      </w:r>
+      <w:r>
+        <w:rPr>
+          <w:rFonts w:eastAsia="Georgia" w:hAnsi="Georgia" w:cs="Georgia"/>
+        </w:rPr>
+        <w:t>DATE_TRUNC('month', activity_date) AS activity_month,</w:t>
+      </w:r>
+      <w:r>
+        <w:br/>
+      </w:r>
+      <w:r>
+        <w:rPr>
+          <w:rFonts w:eastAsia="Georgia" w:hAnsi="Georgia" w:cs="Georgia"/>
+        </w:rPr>
+        <w:t>user_id</w:t>
+      </w:r>
+      <w:r>
+        <w:br/>
+      </w:r>
+      <w:r>
+        <w:rPr>
+          <w:rFonts w:eastAsia="Georgia" w:hAnsi="Georgia" w:cs="Georgia"/>
+        </w:rPr>
+        <w:t>FROM user_activities</w:t>
+      </w:r>
+      <w:r>
+        <w:br/>
+        <w:t>)</w:t>
+      </w:r>
+      <w:r>
+        <w:br/>
+        <w:t>SELECT</w:t>
+      </w:r>
+      <w:r>
+        <w:br/>
+      </w:r>
+      <w:r>
+        <w:rPr>
+          <w:rFonts w:eastAsia="Georgia" w:hAnsi="Georgia" w:cs="Georgia"/>
+        </w:rPr>
+        <w:t>c.cohort_month,</w:t>
+      </w:r>
+      <w:r>
+        <w:br/>
+      </w:r>
+      <w:r>
+        <w:rPr>
+          <w:rFonts w:eastAsia="Georgia" w:hAnsi="Georgia" w:cs="Georgia"/>
+        </w:rPr>
+        <w:t>DATE_PART('month', ua.activity_month - c.cohort_month) AS months_since_signup,</w:t>
+      </w:r>
+      <w:r>
+        <w:br/>
+      </w:r>
+      <w:r>
+        <w:rPr>
+          <w:rFonts w:eastAsia="Georgia" w:hAnsi="Georgia" w:cs="Georgia"/>
+        </w:rPr>
+        <w:t>COUNT(DISTINCT ua.user_id) AS active_users</w:t>
+      </w:r>
+      <w:r>
+        <w:br/>
+        <w:t>FROM cohorts c</w:t>
+      </w:r>
+      <w:r>
+        <w:br/>
+      </w:r>
+      <w:r>
+        <w:rPr>
+          <w:rFonts w:eastAsia="Georgia" w:hAnsi="Georgia" w:cs="Georgia"/>
+        </w:rPr>
+        <w:t>LEFT JOIN user_activity ua ON c.user_id = ua.user_id</w:t>
+      </w:r>
+      <w:r>
+        <w:br/>
+      </w:r>
+      <w:r>
+        <w:rPr>
+          <w:rFonts w:eastAsia="Georgia" w:hAnsi="Georgia" w:cs="Georgia"/>
+        </w:rPr>
+        <w:t>GROUP BY c.cohort_month, months_since_signup</w:t>
+      </w:r>
+      <w:r>
+        <w:br/>
+      </w:r>
+      <w:r>
+        <w:rPr>
+          <w:rFonts w:eastAsia="Georgia" w:hAnsi="Georgia" w:cs="Georgia"/>
+        </w:rPr>
+        <w:t>ORDER BY c.cohort_month, months_since_signup;</w:t>
       </w:r>
     </w:p>
     <w:p>
       <w:pPr>
         <w:spacing w:before="240" w:line="271" w:lineRule="auto"/>
       </w:pPr>
-      <w:bookmarkStart w:id="138" w:name="question_4_nth_highest_salary"/>
+      <w:bookmarkStart w:id="145" w:name="scenario_4_data_quality_check"/>
       <w:r>
         <w:rPr>
           <w:b/>
           <w:sz w:val="33"/>
         </w:rPr>
-        <w:t>Question 4: Nth Highest Salary</w:t>
-      </w:r>
-      <w:bookmarkEnd w:id="138"/>
+        <w:t>Scenario 4: Data Quality Check</w:t>
+      </w:r>
+      <w:bookmarkEnd w:id="145"/>
     </w:p>
     <w:p>
       <w:pPr>
@@ -30838,748 +31707,215 @@
         <w:t>Problem:</w:t>
       </w:r>
       <w:r>
-        <w:t xml:space="preserve"> Find the Nth highest salary (general solution).</w:t>
-      </w:r>
-    </w:p>
-    <w:p>
-      <w:pPr>
-        <w:spacing w:after="210"/>
-      </w:pPr>
+        <w:t xml:space="preserve"> Find data issues (NULL values, invalid entries).</w:t>
+      </w:r>
+    </w:p>
+    <w:p>
+      <w:pPr>
+        <w:spacing w:after="210"/>
+      </w:pPr>
+      <w:r>
+        <w:t>SELECT</w:t>
+      </w:r>
+      <w:r>
+        <w:br/>
+      </w:r>
+      <w:r>
+        <w:rPr>
+          <w:rFonts w:eastAsia="Georgia" w:hAnsi="Georgia" w:cs="Georgia"/>
+        </w:rPr>
+        <w:t>COUNT(*) AS total_rows,</w:t>
+      </w:r>
+      <w:r>
+        <w:br/>
+      </w:r>
+      <w:r>
+        <w:rPr>
+          <w:rFonts w:eastAsia="Georgia" w:hAnsi="Georgia" w:cs="Georgia"/>
+        </w:rPr>
+        <w:t>SUM(CASE WHEN email IS NULL THEN 1 ELSE 0 END) AS missing_emails,</w:t>
+      </w:r>
+      <w:r>
+        <w:br/>
+      </w:r>
+      <w:r>
+        <w:rPr>
+          <w:rFonts w:eastAsia="Georgia" w:hAnsi="Georgia" w:cs="Georgia"/>
+        </w:rPr>
+        <w:t>SUM(CASE WHEN salary &lt;= 0 THEN 1 ELSE 0 END) AS invalid_salaries,</w:t>
+      </w:r>
+      <w:r>
+        <w:br/>
+      </w:r>
+      <w:r>
+        <w:rPr>
+          <w:rFonts w:eastAsia="Georgia" w:hAnsi="Georgia" w:cs="Georgia"/>
+        </w:rPr>
+        <w:t>SUM(CASE WHEN hire_date &gt; CURRENT_DATE THEN 1 ELSE 0 END) AS future_dates</w:t>
+      </w:r>
+      <w:r>
+        <w:br/>
+        <w:t>FROM employees;</w:t>
+      </w:r>
+    </w:p>
+    <w:p>
+      <w:pPr>
+        <w:spacing w:before="240" w:line="271" w:lineRule="auto"/>
+      </w:pPr>
+      <w:bookmarkStart w:id="146" w:name="scenario_5_consecutive_days_active"/>
+      <w:r>
+        <w:rPr>
+          <w:b/>
+          <w:sz w:val="33"/>
+        </w:rPr>
+        <w:t>Scenario 5: Consecutive Days Active</w:t>
+      </w:r>
+      <w:bookmarkEnd w:id="146"/>
+    </w:p>
+    <w:p>
+      <w:pPr>
+        <w:spacing w:after="210"/>
+      </w:pPr>
+      <w:r>
+        <w:rPr>
+          <w:b/>
+        </w:rPr>
+        <w:t>Problem:</w:t>
+      </w:r>
+      <w:r>
+        <w:t xml:space="preserve"> Find users active on consecutive days.</w:t>
+      </w:r>
+    </w:p>
+    <w:p>
+      <w:pPr>
+        <w:spacing w:after="210"/>
+      </w:pPr>
+      <w:r>
+        <w:rPr>
+          <w:rFonts w:eastAsia="Georgia" w:hAnsi="Georgia" w:cs="Georgia"/>
+        </w:rPr>
+        <w:t>WITH daily_activity AS (</w:t>
+      </w:r>
+      <w:r>
+        <w:br/>
+      </w:r>
+      <w:r>
+        <w:rPr>
+          <w:rFonts w:eastAsia="Georgia" w:hAnsi="Georgia" w:cs="Georgia"/>
+        </w:rPr>
+        <w:t>SELECT DISTINCT user_id, activity_date</w:t>
+      </w:r>
+      <w:r>
+        <w:br/>
+      </w:r>
+      <w:r>
+        <w:rPr>
+          <w:rFonts w:eastAsia="Georgia" w:hAnsi="Georgia" w:cs="Georgia"/>
+        </w:rPr>
+        <w:t>FROM user_logs</w:t>
+      </w:r>
+      <w:r>
+        <w:br/>
+        <w:t>),</w:t>
+      </w:r>
+      <w:r>
+        <w:br/>
+      </w:r>
+      <w:r>
+        <w:rPr>
+          <w:rFonts w:eastAsia="Georgia" w:hAnsi="Georgia" w:cs="Georgia"/>
+        </w:rPr>
+        <w:t>activity_with_gap AS (</w:t>
+      </w:r>
+      <w:r>
+        <w:br/>
+        <w:t>SELECT</w:t>
+      </w:r>
+      <w:r>
+        <w:br/>
+      </w:r>
+      <w:r>
+        <w:rPr>
+          <w:rFonts w:eastAsia="Georgia" w:hAnsi="Georgia" w:cs="Georgia"/>
+        </w:rPr>
+        <w:t>user_id,</w:t>
+      </w:r>
+      <w:r>
+        <w:br/>
+      </w:r>
+      <w:r>
+        <w:rPr>
+          <w:rFonts w:eastAsia="Georgia" w:hAnsi="Georgia" w:cs="Georgia"/>
+        </w:rPr>
+        <w:t>activity_date,</w:t>
+      </w:r>
+      <w:r>
+        <w:br/>
+      </w:r>
+      <w:r>
+        <w:rPr>
+          <w:rFonts w:eastAsia="Georgia" w:hAnsi="Georgia" w:cs="Georgia"/>
+        </w:rPr>
+        <w:t>ROW_NUMBER() OVER (PARTITION BY user_id ORDER BY activity_date) AS seq,</w:t>
+      </w:r>
+      <w:r>
+        <w:br/>
+      </w:r>
+      <w:r>
+        <w:rPr>
+          <w:rFonts w:eastAsia="Georgia" w:hAnsi="Georgia" w:cs="Georgia"/>
+        </w:rPr>
+        <w:t>activity_date - ROW_NUMBER() OVER (PARTITION BY user_id ORDER BY activity_date) INTERVAL '1 day' AS grp</w:t>
+      </w:r>
+      <w:r>
+        <w:br/>
+      </w:r>
+      <w:r>
+        <w:rPr>
+          <w:rFonts w:eastAsia="Georgia" w:hAnsi="Georgia" w:cs="Georgia"/>
+        </w:rPr>
+        <w:t>FROM daily_activity</w:t>
+      </w:r>
+      <w:r>
+        <w:br/>
+        <w:t>)</w:t>
+      </w:r>
+      <w:r>
+        <w:br/>
+        <w:t>SELECT</w:t>
+      </w:r>
+      <w:r>
+        <w:br/>
+      </w:r>
+      <w:r>
+        <w:rPr>
+          <w:rFonts w:eastAsia="Georgia" w:hAnsi="Georgia" w:cs="Georgia"/>
+        </w:rPr>
+        <w:t>user_id,</w:t>
+      </w:r>
+      <w:r>
+        <w:br/>
+      </w:r>
+      <w:r>
+        <w:rPr>
+          <w:rFonts w:eastAsia="Georgia" w:hAnsi="Georgia" w:cs="Georgia"/>
+        </w:rPr>
+        <w:t>MIN(activity_date) AS streak_start,</w:t>
+      </w:r>
+      <w:r>
+        <w:br/>
+      </w:r>
+      <w:r>
+        <w:rPr>
+          <w:rFonts w:eastAsia="Georgia" w:hAnsi="Georgia" w:cs="Georgia"/>
+        </w:rPr>
+        <w:t>MAX(activity_date) AS streak_end,</w:t>
+      </w:r>
+      <w:r>
+        <w:br/>
+      </w:r>
       <w:r>
         <w:lastRenderedPageBreak/>
-        <w:t>SELECT salary</w:t>
-      </w:r>
-      <w:r>
-        <w:br/>
-        <w:t>FROM (</w:t>
-      </w:r>
-      <w:r>
-        <w:br/>
-      </w:r>
-      <w:r>
-        <w:rPr>
-          <w:rFonts w:eastAsia="Georgia" w:hAnsi="Georgia" w:cs="Georgia"/>
-        </w:rPr>
-        <w:t>SELECT DISTINCT salary, DENSE_RANK() OVER (ORDER BY salary DESC) AS rnk</w:t>
-      </w:r>
-      <w:r>
-        <w:br/>
-        <w:t>FROM employees</w:t>
-      </w:r>
-      <w:r>
-        <w:br/>
-        <w:t>) ranked</w:t>
-      </w:r>
-      <w:r>
-        <w:br/>
-        <w:t>WHERE rnk = N; -- Replace N with the value you want</w:t>
-      </w:r>
-    </w:p>
-    <w:p>
-      <w:pPr>
-        <w:spacing w:before="240" w:line="271" w:lineRule="auto"/>
-      </w:pPr>
-      <w:bookmarkStart w:id="139" w:name="question_5_employees_with_above_a_26cca2"/>
-      <w:r>
-        <w:rPr>
-          <w:b/>
-          <w:sz w:val="33"/>
-        </w:rPr>
-        <w:t>Question 5: Employees with Above Average Salary</w:t>
-      </w:r>
-      <w:bookmarkEnd w:id="139"/>
-    </w:p>
-    <w:p>
-      <w:pPr>
-        <w:spacing w:after="210"/>
-      </w:pPr>
-      <w:r>
-        <w:rPr>
-          <w:b/>
-        </w:rPr>
-        <w:t>Problem:</w:t>
-      </w:r>
-      <w:r>
-        <w:t xml:space="preserve"> Find employees earning more than the average.</w:t>
-      </w:r>
-    </w:p>
-    <w:p>
-      <w:pPr>
-        <w:spacing w:after="210"/>
-      </w:pPr>
-      <w:r>
-        <w:t>SELECT name, salary, department</w:t>
-      </w:r>
-      <w:r>
-        <w:br/>
-        <w:t>FROM employees</w:t>
-      </w:r>
-      <w:r>
-        <w:br/>
-        <w:t>WHERE salary &gt; (SELECT AVG(salary) FROM employees);</w:t>
-      </w:r>
-    </w:p>
-    <w:p>
-      <w:pPr>
-        <w:spacing w:before="240" w:line="271" w:lineRule="auto"/>
-      </w:pPr>
-      <w:bookmarkStart w:id="140" w:name="question_6_department_with_highes_2a20af"/>
-      <w:r>
-        <w:rPr>
-          <w:b/>
-          <w:sz w:val="33"/>
-        </w:rPr>
-        <w:t>Question 6: Department with Highest Average Salary</w:t>
-      </w:r>
-      <w:bookmarkEnd w:id="140"/>
-    </w:p>
-    <w:p>
-      <w:pPr>
-        <w:spacing w:after="210"/>
-      </w:pPr>
-      <w:r>
-        <w:rPr>
-          <w:b/>
-        </w:rPr>
-        <w:t>Problem:</w:t>
-      </w:r>
-      <w:r>
-        <w:t xml:space="preserve"> Which department has the highest average salary?</w:t>
-      </w:r>
-    </w:p>
-    <w:p>
-      <w:pPr>
-        <w:spacing w:after="210"/>
-      </w:pPr>
-      <w:r>
-        <w:rPr>
-          <w:rFonts w:eastAsia="Georgia" w:hAnsi="Georgia" w:cs="Georgia"/>
-        </w:rPr>
-        <w:t>SELECT department, AVG(salary) AS avg_sal</w:t>
-      </w:r>
-      <w:r>
-        <w:br/>
-        <w:t>FROM employees</w:t>
-      </w:r>
-      <w:r>
-        <w:br/>
-        <w:t>GROUP BY department</w:t>
-      </w:r>
-      <w:r>
-        <w:br/>
-      </w:r>
-      <w:r>
-        <w:rPr>
-          <w:rFonts w:eastAsia="Georgia" w:hAnsi="Georgia" w:cs="Georgia"/>
-        </w:rPr>
-        <w:t>ORDER BY avg_sal DESC</w:t>
-      </w:r>
-      <w:r>
-        <w:br/>
-        <w:t>LIMIT 1;</w:t>
-      </w:r>
-    </w:p>
-    <w:p>
-      <w:pPr>
-        <w:spacing w:before="240" w:line="271" w:lineRule="auto"/>
-      </w:pPr>
-      <w:bookmarkStart w:id="141" w:name="real_world_sql_scenarios"/>
-      <w:r>
-        <w:rPr>
-          <w:b/>
-          <w:sz w:val="42"/>
-        </w:rPr>
-        <w:t>Real-World SQL Scenarios</w:t>
-      </w:r>
-      <w:bookmarkEnd w:id="141"/>
-    </w:p>
-    <w:p>
-      <w:pPr>
-        <w:spacing w:before="240" w:line="271" w:lineRule="auto"/>
-      </w:pPr>
-      <w:bookmarkStart w:id="142" w:name="scenario_1_customer_lifetime_value"/>
-      <w:r>
-        <w:rPr>
-          <w:b/>
-          <w:sz w:val="33"/>
-        </w:rPr>
-        <w:t>Scenario 1: Customer Lifetime Value</w:t>
-      </w:r>
-      <w:bookmarkEnd w:id="142"/>
-    </w:p>
-    <w:p>
-      <w:pPr>
-        <w:spacing w:after="210"/>
-      </w:pPr>
-      <w:r>
-        <w:rPr>
-          <w:b/>
-        </w:rPr>
-        <w:t>Problem:</w:t>
-      </w:r>
-      <w:r>
-        <w:t xml:space="preserve"> Calculate total spending per customer.</w:t>
-      </w:r>
-    </w:p>
-    <w:p>
-      <w:pPr>
-        <w:spacing w:after="210"/>
-      </w:pPr>
-      <w:r>
-        <w:t>SELECT</w:t>
-      </w:r>
-      <w:r>
-        <w:br/>
-      </w:r>
-      <w:r>
-        <w:rPr>
-          <w:rFonts w:eastAsia="Georgia" w:hAnsi="Georgia" w:cs="Georgia"/>
-        </w:rPr>
-        <w:t>customer_id,</w:t>
-      </w:r>
-      <w:r>
-        <w:br/>
-      </w:r>
-      <w:r>
-        <w:rPr>
-          <w:rFonts w:eastAsia="Georgia" w:hAnsi="Georgia" w:cs="Georgia"/>
-        </w:rPr>
-        <w:t>customer_name,</w:t>
-      </w:r>
-      <w:r>
-        <w:br/>
-      </w:r>
-      <w:r>
-        <w:rPr>
-          <w:rFonts w:eastAsia="Georgia" w:hAnsi="Georgia" w:cs="Georgia"/>
-        </w:rPr>
-        <w:t>COUNT(order_id) AS order_count,</w:t>
-      </w:r>
-      <w:r>
-        <w:br/>
-      </w:r>
-      <w:r>
-        <w:rPr>
-          <w:rFonts w:eastAsia="Georgia" w:hAnsi="Georgia" w:cs="Georgia"/>
-        </w:rPr>
-        <w:t>SUM(order_amount) AS total_spent,</w:t>
-      </w:r>
-      <w:r>
-        <w:br/>
-      </w:r>
-      <w:r>
-        <w:rPr>
-          <w:rFonts w:eastAsia="Georgia" w:hAnsi="Georgia" w:cs="Georgia"/>
-        </w:rPr>
-        <w:t>AVG(order_amount) AS avg_order_value</w:t>
-      </w:r>
-      <w:r>
-        <w:br/>
-        <w:t>FROM orders</w:t>
-      </w:r>
-      <w:r>
-        <w:br/>
-      </w:r>
-      <w:r>
-        <w:rPr>
-          <w:rFonts w:eastAsia="Georgia" w:hAnsi="Georgia" w:cs="Georgia"/>
-        </w:rPr>
-        <w:t>GROUP BY customer_id, customer_name</w:t>
-      </w:r>
-      <w:r>
-        <w:br/>
-      </w:r>
-      <w:r>
-        <w:rPr>
-          <w:rFonts w:eastAsia="Georgia" w:hAnsi="Georgia" w:cs="Georgia"/>
-        </w:rPr>
-        <w:t>ORDER BY total_spent DESC;</w:t>
-      </w:r>
-    </w:p>
-    <w:p>
-      <w:pPr>
-        <w:spacing w:before="240" w:line="271" w:lineRule="auto"/>
-      </w:pPr>
-      <w:bookmarkStart w:id="143" w:name="scenario_2_monthly_growth_rate"/>
-      <w:r>
-        <w:rPr>
-          <w:b/>
-          <w:sz w:val="33"/>
-        </w:rPr>
-        <w:t>Scenario 2: Monthly Growth Rate</w:t>
-      </w:r>
-      <w:bookmarkEnd w:id="143"/>
-    </w:p>
-    <w:p>
-      <w:pPr>
-        <w:spacing w:after="210"/>
-      </w:pPr>
-      <w:r>
-        <w:rPr>
-          <w:b/>
-        </w:rPr>
-        <w:t>Problem:</w:t>
-      </w:r>
-      <w:r>
-        <w:t xml:space="preserve"> Show month-on-month sales growth.</w:t>
-      </w:r>
-    </w:p>
-    <w:p>
-      <w:pPr>
-        <w:spacing w:after="210"/>
-      </w:pPr>
-      <w:r>
-        <w:t>SELECT</w:t>
-      </w:r>
-      <w:r>
-        <w:br/>
-        <w:t>month,</w:t>
-      </w:r>
-      <w:r>
-        <w:br/>
-        <w:t>revenue,</w:t>
-      </w:r>
-      <w:r>
-        <w:br/>
-      </w:r>
-      <w:r>
-        <w:rPr>
-          <w:rFonts w:eastAsia="Georgia" w:hAnsi="Georgia" w:cs="Georgia"/>
-        </w:rPr>
-        <w:t>LAG(revenue) OVER (ORDER BY month) AS prev_month_revenue,</w:t>
-      </w:r>
-      <w:r>
-        <w:br/>
-        <w:t>ROUND(((revenue - LAG(revenue) OVER (ORDER BY month)) /</w:t>
-      </w:r>
-      <w:r>
-        <w:br/>
-      </w:r>
-      <w:r>
-        <w:rPr>
-          <w:rFonts w:eastAsia="Georgia" w:hAnsi="Georgia" w:cs="Georgia"/>
-        </w:rPr>
-        <w:lastRenderedPageBreak/>
-        <w:t>LAG(revenue) OVER (ORDER BY month)) * 100, 2) AS growth_percent</w:t>
-      </w:r>
-      <w:r>
-        <w:br/>
-      </w:r>
-      <w:r>
-        <w:rPr>
-          <w:rFonts w:eastAsia="Georgia" w:hAnsi="Georgia" w:cs="Georgia"/>
-        </w:rPr>
-        <w:t>FROM monthly_sales</w:t>
-      </w:r>
-      <w:r>
-        <w:br/>
-        <w:t>ORDER BY month;</w:t>
-      </w:r>
-    </w:p>
-    <w:p>
-      <w:pPr>
-        <w:spacing w:before="240" w:line="271" w:lineRule="auto"/>
-      </w:pPr>
-      <w:bookmarkStart w:id="144" w:name="scenario_3_cohort_analysis"/>
-      <w:r>
-        <w:rPr>
-          <w:b/>
-          <w:sz w:val="33"/>
-        </w:rPr>
-        <w:t>Scenario 3: Cohort Analysis</w:t>
-      </w:r>
-      <w:bookmarkEnd w:id="144"/>
-    </w:p>
-    <w:p>
-      <w:pPr>
-        <w:spacing w:after="210"/>
-      </w:pPr>
-      <w:r>
-        <w:rPr>
-          <w:b/>
-        </w:rPr>
-        <w:t>Problem:</w:t>
-      </w:r>
-      <w:r>
-        <w:t xml:space="preserve"> Track user retention by signup month.</w:t>
-      </w:r>
-    </w:p>
-    <w:p>
-      <w:pPr>
-        <w:spacing w:after="210"/>
-      </w:pPr>
-      <w:r>
-        <w:t>WITH cohorts AS (</w:t>
-      </w:r>
-      <w:r>
-        <w:br/>
-        <w:t>SELECT</w:t>
-      </w:r>
-      <w:r>
-        <w:br/>
-      </w:r>
-      <w:r>
-        <w:rPr>
-          <w:rFonts w:eastAsia="Georgia" w:hAnsi="Georgia" w:cs="Georgia"/>
-        </w:rPr>
-        <w:t>DATE_TRUNC('month', signup_date) AS cohort_month,</w:t>
-      </w:r>
-      <w:r>
-        <w:br/>
-      </w:r>
-      <w:r>
-        <w:rPr>
-          <w:rFonts w:eastAsia="Georgia" w:hAnsi="Georgia" w:cs="Georgia"/>
-        </w:rPr>
-        <w:t>user_id</w:t>
-      </w:r>
-      <w:r>
-        <w:br/>
-        <w:t>FROM users</w:t>
-      </w:r>
-      <w:r>
-        <w:br/>
-        <w:t>),</w:t>
-      </w:r>
-      <w:r>
-        <w:br/>
-      </w:r>
-      <w:r>
-        <w:rPr>
-          <w:rFonts w:eastAsia="Georgia" w:hAnsi="Georgia" w:cs="Georgia"/>
-        </w:rPr>
-        <w:t>user_activity AS (</w:t>
-      </w:r>
-      <w:r>
-        <w:br/>
-        <w:t>SELECT</w:t>
-      </w:r>
-      <w:r>
-        <w:br/>
-      </w:r>
-      <w:r>
-        <w:rPr>
-          <w:rFonts w:eastAsia="Georgia" w:hAnsi="Georgia" w:cs="Georgia"/>
-        </w:rPr>
-        <w:t>DATE_TRUNC('month', activity_date) AS activity_month,</w:t>
-      </w:r>
-      <w:r>
-        <w:br/>
-      </w:r>
-      <w:r>
-        <w:rPr>
-          <w:rFonts w:eastAsia="Georgia" w:hAnsi="Georgia" w:cs="Georgia"/>
-        </w:rPr>
-        <w:t>user_id</w:t>
-      </w:r>
-      <w:r>
-        <w:br/>
-      </w:r>
-      <w:r>
-        <w:rPr>
-          <w:rFonts w:eastAsia="Georgia" w:hAnsi="Georgia" w:cs="Georgia"/>
-        </w:rPr>
-        <w:t>FROM user_activities</w:t>
-      </w:r>
-      <w:r>
-        <w:br/>
-        <w:t>)</w:t>
-      </w:r>
-      <w:r>
-        <w:br/>
-        <w:t>SELECT</w:t>
-      </w:r>
-      <w:r>
-        <w:br/>
-      </w:r>
-      <w:r>
-        <w:rPr>
-          <w:rFonts w:eastAsia="Georgia" w:hAnsi="Georgia" w:cs="Georgia"/>
-        </w:rPr>
-        <w:t>c.cohort_month,</w:t>
-      </w:r>
-      <w:r>
-        <w:br/>
-      </w:r>
-      <w:r>
-        <w:rPr>
-          <w:rFonts w:eastAsia="Georgia" w:hAnsi="Georgia" w:cs="Georgia"/>
-        </w:rPr>
-        <w:t>DATE_PART('month', ua.activity_month - c.cohort_month) AS months_since_signup,</w:t>
-      </w:r>
-      <w:r>
-        <w:br/>
-      </w:r>
-      <w:r>
-        <w:rPr>
-          <w:rFonts w:eastAsia="Georgia" w:hAnsi="Georgia" w:cs="Georgia"/>
-        </w:rPr>
-        <w:t>COUNT(DISTINCT ua.user_id) AS active_users</w:t>
-      </w:r>
-      <w:r>
-        <w:br/>
-        <w:t>FROM cohorts c</w:t>
-      </w:r>
-      <w:r>
-        <w:br/>
-      </w:r>
-      <w:r>
-        <w:rPr>
-          <w:rFonts w:eastAsia="Georgia" w:hAnsi="Georgia" w:cs="Georgia"/>
-        </w:rPr>
-        <w:t>LEFT JOIN user_activity ua ON c.user_id = ua.user_id</w:t>
-      </w:r>
-      <w:r>
-        <w:br/>
-      </w:r>
-      <w:r>
-        <w:rPr>
-          <w:rFonts w:eastAsia="Georgia" w:hAnsi="Georgia" w:cs="Georgia"/>
-        </w:rPr>
-        <w:t>GROUP BY c.cohort_month, months_since_signup</w:t>
-      </w:r>
-      <w:r>
-        <w:br/>
-      </w:r>
-      <w:r>
-        <w:rPr>
-          <w:rFonts w:eastAsia="Georgia" w:hAnsi="Georgia" w:cs="Georgia"/>
-        </w:rPr>
-        <w:t>ORDER BY c.cohort_month, months_since_signup;</w:t>
-      </w:r>
-    </w:p>
-    <w:p>
-      <w:pPr>
-        <w:spacing w:before="240" w:line="271" w:lineRule="auto"/>
-      </w:pPr>
-      <w:bookmarkStart w:id="145" w:name="scenario_4_data_quality_check"/>
-      <w:r>
-        <w:rPr>
-          <w:b/>
-          <w:sz w:val="33"/>
-        </w:rPr>
-        <w:t>Scenario 4: Data Quality Check</w:t>
-      </w:r>
-      <w:bookmarkEnd w:id="145"/>
-    </w:p>
-    <w:p>
-      <w:pPr>
-        <w:spacing w:after="210"/>
-      </w:pPr>
-      <w:r>
-        <w:rPr>
-          <w:b/>
-        </w:rPr>
-        <w:t>Problem:</w:t>
-      </w:r>
-      <w:r>
-        <w:t xml:space="preserve"> Find data issues (NULL values, invalid entries).</w:t>
-      </w:r>
-    </w:p>
-    <w:p>
-      <w:pPr>
-        <w:spacing w:after="210"/>
-      </w:pPr>
-      <w:r>
-        <w:t>SELECT</w:t>
-      </w:r>
-      <w:r>
-        <w:br/>
-      </w:r>
-      <w:r>
-        <w:rPr>
-          <w:rFonts w:eastAsia="Georgia" w:hAnsi="Georgia" w:cs="Georgia"/>
-        </w:rPr>
-        <w:t>COUNT(*) AS total_rows,</w:t>
-      </w:r>
-      <w:r>
-        <w:br/>
-      </w:r>
-      <w:r>
-        <w:rPr>
-          <w:rFonts w:eastAsia="Georgia" w:hAnsi="Georgia" w:cs="Georgia"/>
-        </w:rPr>
-        <w:t>SUM(CASE WHEN email IS NULL THEN 1 ELSE 0 END) AS missing_emails,</w:t>
-      </w:r>
-      <w:r>
-        <w:br/>
-      </w:r>
-      <w:r>
-        <w:rPr>
-          <w:rFonts w:eastAsia="Georgia" w:hAnsi="Georgia" w:cs="Georgia"/>
-        </w:rPr>
-        <w:t>SUM(CASE WHEN salary &lt;= 0 THEN 1 ELSE 0 END) AS invalid_salaries,</w:t>
-      </w:r>
-      <w:r>
-        <w:br/>
-      </w:r>
-      <w:r>
-        <w:rPr>
-          <w:rFonts w:eastAsia="Georgia" w:hAnsi="Georgia" w:cs="Georgia"/>
-        </w:rPr>
-        <w:t>SUM(CASE WHEN hire_date &gt; CURRENT_DATE THEN 1 ELSE 0 END) AS future_dates</w:t>
-      </w:r>
-      <w:r>
-        <w:br/>
-        <w:t>FROM employees;</w:t>
-      </w:r>
-    </w:p>
-    <w:p>
-      <w:pPr>
-        <w:spacing w:before="240" w:line="271" w:lineRule="auto"/>
-      </w:pPr>
-      <w:bookmarkStart w:id="146" w:name="scenario_5_consecutive_days_active"/>
-      <w:r>
-        <w:rPr>
-          <w:b/>
-          <w:sz w:val="33"/>
-        </w:rPr>
-        <w:t>Scenario 5: Consecutive Days Active</w:t>
-      </w:r>
-      <w:bookmarkEnd w:id="146"/>
-    </w:p>
-    <w:p>
-      <w:pPr>
-        <w:spacing w:after="210"/>
-      </w:pPr>
-      <w:r>
-        <w:rPr>
-          <w:b/>
-        </w:rPr>
-        <w:t>Problem:</w:t>
-      </w:r>
-      <w:r>
-        <w:t xml:space="preserve"> Find users active on consecutive days.</w:t>
-      </w:r>
-    </w:p>
-    <w:p>
-      <w:pPr>
-        <w:spacing w:after="210"/>
-      </w:pPr>
-      <w:r>
-        <w:rPr>
-          <w:rFonts w:eastAsia="Georgia" w:hAnsi="Georgia" w:cs="Georgia"/>
-        </w:rPr>
-        <w:t>WITH daily_activity AS (</w:t>
-      </w:r>
-      <w:r>
-        <w:br/>
-      </w:r>
-      <w:r>
-        <w:rPr>
-          <w:rFonts w:eastAsia="Georgia" w:hAnsi="Georgia" w:cs="Georgia"/>
-        </w:rPr>
-        <w:t>SELECT DISTINCT user_id, activity_date</w:t>
-      </w:r>
-      <w:r>
-        <w:br/>
-      </w:r>
-      <w:r>
-        <w:rPr>
-          <w:rFonts w:eastAsia="Georgia" w:hAnsi="Georgia" w:cs="Georgia"/>
-        </w:rPr>
-        <w:t>FROM user_logs</w:t>
-      </w:r>
-      <w:r>
-        <w:br/>
-        <w:t>),</w:t>
-      </w:r>
-      <w:r>
-        <w:br/>
-      </w:r>
-      <w:r>
-        <w:rPr>
-          <w:rFonts w:eastAsia="Georgia" w:hAnsi="Georgia" w:cs="Georgia"/>
-        </w:rPr>
-        <w:t>activity_with_gap AS (</w:t>
-      </w:r>
-      <w:r>
-        <w:br/>
-        <w:t>SELECT</w:t>
-      </w:r>
-      <w:r>
-        <w:br/>
-      </w:r>
-      <w:r>
-        <w:rPr>
-          <w:rFonts w:eastAsia="Georgia" w:hAnsi="Georgia" w:cs="Georgia"/>
-        </w:rPr>
-        <w:t>user_id,</w:t>
-      </w:r>
-      <w:r>
-        <w:br/>
-      </w:r>
-      <w:r>
-        <w:rPr>
-          <w:rFonts w:eastAsia="Georgia" w:hAnsi="Georgia" w:cs="Georgia"/>
-        </w:rPr>
-        <w:t>activity_date,</w:t>
-      </w:r>
-      <w:r>
-        <w:br/>
-      </w:r>
-      <w:r>
-        <w:rPr>
-          <w:rFonts w:eastAsia="Georgia" w:hAnsi="Georgia" w:cs="Georgia"/>
-        </w:rPr>
-        <w:t>ROW_NUMBER() OVER (PARTITION BY user_id ORDER BY activity_date) AS seq,</w:t>
-      </w:r>
-      <w:r>
-        <w:br/>
-      </w:r>
-      <w:r>
-        <w:rPr>
-          <w:rFonts w:eastAsia="Georgia" w:hAnsi="Georgia" w:cs="Georgia"/>
-        </w:rPr>
-        <w:lastRenderedPageBreak/>
-        <w:t>activity_date - ROW_NUMBER() OVER (PARTITION BY user_id ORDER BY activity_date) INTERVAL '1 day' AS grp</w:t>
-      </w:r>
-      <w:r>
-        <w:br/>
-      </w:r>
-      <w:r>
-        <w:rPr>
-          <w:rFonts w:eastAsia="Georgia" w:hAnsi="Georgia" w:cs="Georgia"/>
-        </w:rPr>
-        <w:t>FROM daily_activity</w:t>
-      </w:r>
-      <w:r>
-        <w:br/>
-        <w:t>)</w:t>
-      </w:r>
-      <w:r>
-        <w:br/>
-        <w:t>SELECT</w:t>
-      </w:r>
-      <w:r>
-        <w:br/>
-      </w:r>
-      <w:r>
-        <w:rPr>
-          <w:rFonts w:eastAsia="Georgia" w:hAnsi="Georgia" w:cs="Georgia"/>
-        </w:rPr>
-        <w:t>user_id,</w:t>
-      </w:r>
-      <w:r>
-        <w:br/>
-      </w:r>
-      <w:r>
-        <w:rPr>
-          <w:rFonts w:eastAsia="Georgia" w:hAnsi="Georgia" w:cs="Georgia"/>
-        </w:rPr>
-        <w:t>MIN(activity_date) AS streak_start,</w:t>
-      </w:r>
-      <w:r>
-        <w:br/>
-      </w:r>
-      <w:r>
-        <w:rPr>
-          <w:rFonts w:eastAsia="Georgia" w:hAnsi="Georgia" w:cs="Georgia"/>
-        </w:rPr>
-        <w:t>MAX(activity_date) AS streak_end,</w:t>
-      </w:r>
-      <w:r>
-        <w:br/>
         <w:t>COUNT(</w:t>
       </w:r>
       <w:r>
@@ -31782,7 +32118,7 @@
       <w:r>
         <w:t xml:space="preserve">SELECT </w:t>
       </w:r>
-      <w:hyperlink r:id="rId28">
+      <w:hyperlink r:id="rId36">
         <w:r>
           <w:rPr>
             <w:color w:val="4472C4"/>
@@ -31838,7 +32174,7 @@
       <w:r>
         <w:t xml:space="preserve">SELECT </w:t>
       </w:r>
-      <w:hyperlink r:id="rId29">
+      <w:hyperlink r:id="rId37">
         <w:r>
           <w:rPr>
             <w:color w:val="4472C4"/>
@@ -31875,7 +32211,6 @@
         <w:rPr>
           <w:b/>
         </w:rPr>
-        <w:lastRenderedPageBreak/>
         <w:t>Answer:</w:t>
       </w:r>
       <w:r>
@@ -31920,6 +32255,7 @@
         <w:rPr>
           <w:noProof/>
         </w:rPr>
+        <w:lastRenderedPageBreak/>
         <w:pict w14:anchorId="0F71B88A">
           <v:rect id="_x0000_i1092" alt="" style="width:434.5pt;height:.05pt;mso-width-percent:0;mso-height-percent:0;mso-width-percent:0;mso-height-percent:0" o:hralign="center" o:hrstd="t" o:hr="t"/>
         </w:pict>
@@ -32145,9 +32481,6 @@
       </w:r>
       <w:r>
         <w:br/>
-      </w:r>
-      <w:r>
-        <w:lastRenderedPageBreak/>
         <w:t>Transactions (BEGIN, COMMIT, ROLLBACK, SAVEPOINT)</w:t>
       </w:r>
       <w:r>
@@ -32179,6 +32512,7 @@
           <w:b/>
           <w:sz w:val="42"/>
         </w:rPr>
+        <w:lastRenderedPageBreak/>
         <w:t>Key Takeaways</w:t>
       </w:r>
       <w:bookmarkEnd w:id="157"/>

</xml_diff>